<commit_message>
update in pdf page for showing the price in PRICE FOR IMPLEMENTATION
</commit_message>
<xml_diff>
--- a/QuotationApp.API/Templates/QuotationTemplate_Updated.docx
+++ b/QuotationApp.API/Templates/QuotationTemplate_Updated.docx
@@ -1064,7 +1064,11 @@
               <w:right w:w="120" w:type="dxa"/>
             </w:tcMar>
           </w:tcPr>
-          <w:p/>
+          <w:p>
+            <w:r>
+              <w:t>{{IMPLEMENTATION_PRICE}}</w:t>
+            </w:r>
+          </w:p>
         </w:tc>
       </w:tr>
       <w:tr>

</xml_diff>

<commit_message>
update about the price update calculation in pdf page
</commit_message>
<xml_diff>
--- a/QuotationApp.API/Templates/QuotationTemplate_Updated.docx
+++ b/QuotationApp.API/Templates/QuotationTemplate_Updated.docx
@@ -43,25 +43,7 @@
           <w:bCs/>
           <w:color w:val="65AADB"/>
         </w:rPr>
-        <w:t>{{</w:t>
-      </w:r>
-      <w:proofErr w:type="spellStart"/>
-      <w:r>
-        <w:rPr>
-          <w:b/>
-          <w:bCs/>
-          <w:color w:val="65AADB"/>
-        </w:rPr>
-        <w:t>OrganizationName</w:t>
-      </w:r>
-      <w:proofErr w:type="spellEnd"/>
-      <w:r>
-        <w:rPr>
-          <w:b/>
-          <w:bCs/>
-          <w:color w:val="65AADB"/>
-        </w:rPr>
-        <w:t>}}</w:t>
+        <w:t>{{OrganizationName}}</w:t>
       </w:r>
     </w:p>
     <w:p>
@@ -152,21 +134,7 @@
         <w:rPr>
           <w:b/>
         </w:rPr>
-        <w:t>{{</w:t>
-      </w:r>
-      <w:proofErr w:type="spellStart"/>
-      <w:r>
-        <w:rPr>
-          <w:b/>
-        </w:rPr>
-        <w:t>QuotationNo</w:t>
-      </w:r>
-      <w:proofErr w:type="spellEnd"/>
-      <w:r>
-        <w:rPr>
-          <w:b/>
-        </w:rPr>
-        <w:t>}}</w:t>
+        <w:t>{{QuotationNo}}</w:t>
       </w:r>
     </w:p>
     <w:p>
@@ -252,7 +220,6 @@
         </w:rPr>
         <w:tab/>
       </w:r>
-      <w:proofErr w:type="gramStart"/>
       <w:r>
         <w:rPr>
           <w:b/>
@@ -267,11 +234,7 @@
         <w:t xml:space="preserve"> </w:t>
       </w:r>
       <w:r>
-        <w:t>{{</w:t>
-      </w:r>
-      <w:proofErr w:type="gramEnd"/>
-      <w:r>
-        <w:t>Date}}</w:t>
+        <w:t>{{Date}}</w:t>
       </w:r>
     </w:p>
     <w:p>
@@ -1053,6 +1016,11 @@
               <w:t xml:space="preserve"> - {{MODULE_LIST}} (single installation). Scope as listed above.</w:t>
             </w:r>
           </w:p>
+          <w:p>
+            <w:r>
+              <w:t>{{MODULE_REQUIREMENTS}}</w:t>
+            </w:r>
+          </w:p>
         </w:tc>
         <w:tc>
           <w:tcPr>
@@ -1066,7 +1034,7 @@
           </w:tcPr>
           <w:p>
             <w:r>
-              <w:t>{{IMPLEMENTATION_PRICE}}</w:t>
+              <w:t>₹{{FinalPrice}}</w:t>
             </w:r>
           </w:p>
         </w:tc>
@@ -1652,15 +1620,7 @@
           </w:p>
           <w:p>
             <w:r>
-              <w:t xml:space="preserve">As done by </w:t>
-            </w:r>
-            <w:proofErr w:type="spellStart"/>
-            <w:r>
-              <w:t>BlechTek</w:t>
-            </w:r>
-            <w:proofErr w:type="spellEnd"/>
-            <w:r>
-              <w:t xml:space="preserve"> Software Solutions LLP on its own.</w:t>
+              <w:t>As done by BlechTek Software Solutions LLP on its own.</w:t>
             </w:r>
           </w:p>
         </w:tc>
@@ -1733,16 +1693,7 @@
           </w:p>
           <w:p>
             <w:r>
-              <w:lastRenderedPageBreak/>
-              <w:t xml:space="preserve">Master </w:t>
-            </w:r>
-            <w:proofErr w:type="spellStart"/>
-            <w:r>
-              <w:t>updation</w:t>
-            </w:r>
-            <w:proofErr w:type="spellEnd"/>
-            <w:r>
-              <w:t>, new feature implementation.</w:t>
+              <w:t>Master updation, new feature implementation.</w:t>
             </w:r>
           </w:p>
         </w:tc>
@@ -1758,7 +1709,6 @@
           </w:tcPr>
           <w:p>
             <w:r>
-              <w:lastRenderedPageBreak/>
               <w:t>Chargeable</w:t>
             </w:r>
           </w:p>
@@ -2044,6 +1994,7 @@
           <w:bCs/>
           <w:color w:val="65AADB"/>
         </w:rPr>
+        <w:lastRenderedPageBreak/>
         <w:t>10. Suggestions by Auditors / Consultants</w:t>
       </w:r>
     </w:p>
@@ -2052,7 +2003,6 @@
         <w:spacing w:after="60"/>
       </w:pPr>
       <w:r>
-        <w:lastRenderedPageBreak/>
         <w:t>Any changes suggested by auditors or consultants must be raised before order finalization; later changes are chargeable separately.</w:t>
       </w:r>
     </w:p>
@@ -2113,25 +2063,7 @@
           <w:bCs/>
           <w:color w:val="65AADB"/>
         </w:rPr>
-        <w:t xml:space="preserve">For </w:t>
-      </w:r>
-      <w:proofErr w:type="spellStart"/>
-      <w:r>
-        <w:rPr>
-          <w:b/>
-          <w:bCs/>
-          <w:color w:val="65AADB"/>
-        </w:rPr>
-        <w:t>BlechTek</w:t>
-      </w:r>
-      <w:proofErr w:type="spellEnd"/>
-      <w:r>
-        <w:rPr>
-          <w:b/>
-          <w:bCs/>
-          <w:color w:val="65AADB"/>
-        </w:rPr>
-        <w:t xml:space="preserve"> Software Solutions LLP</w:t>
+        <w:t>For BlechTek Software Solutions LLP</w:t>
       </w:r>
     </w:p>
     <w:p>
@@ -2285,23 +2217,13 @@
     <w:pPr>
       <w:jc w:val="center"/>
     </w:pPr>
-    <w:proofErr w:type="spellStart"/>
     <w:r>
       <w:rPr>
         <w:color w:val="5B6478"/>
         <w:sz w:val="16"/>
         <w:szCs w:val="16"/>
       </w:rPr>
-      <w:t>BlechTek</w:t>
-    </w:r>
-    <w:proofErr w:type="spellEnd"/>
-    <w:r>
-      <w:rPr>
-        <w:color w:val="5B6478"/>
-        <w:sz w:val="16"/>
-        <w:szCs w:val="16"/>
-      </w:rPr>
-      <w:t xml:space="preserve"> Software Solutions LLP</w:t>
+      <w:t>BlechTek Software Solutions LLP</w:t>
     </w:r>
   </w:p>
   <w:p>
@@ -2314,79 +2236,7 @@
         <w:sz w:val="14"/>
         <w:szCs w:val="14"/>
       </w:rPr>
-      <w:t xml:space="preserve">Address: S.NO. 257/2/2A/4 ABC Business </w:t>
-    </w:r>
-    <w:proofErr w:type="spellStart"/>
-    <w:r>
-      <w:rPr>
-        <w:color w:val="5B6478"/>
-        <w:sz w:val="14"/>
-        <w:szCs w:val="14"/>
-      </w:rPr>
-      <w:t>Center</w:t>
-    </w:r>
-    <w:proofErr w:type="spellEnd"/>
-    <w:r>
-      <w:rPr>
-        <w:color w:val="5B6478"/>
-        <w:sz w:val="14"/>
-        <w:szCs w:val="14"/>
-      </w:rPr>
-      <w:t xml:space="preserve">, S Floor, Opp. </w:t>
-    </w:r>
-    <w:proofErr w:type="spellStart"/>
-    <w:r>
-      <w:rPr>
-        <w:color w:val="5B6478"/>
-        <w:sz w:val="14"/>
-        <w:szCs w:val="14"/>
-      </w:rPr>
-      <w:t>WindMill</w:t>
-    </w:r>
-    <w:proofErr w:type="spellEnd"/>
-    <w:r>
-      <w:rPr>
-        <w:color w:val="5B6478"/>
-        <w:sz w:val="14"/>
-        <w:szCs w:val="14"/>
-      </w:rPr>
-      <w:t xml:space="preserve"> Village Road, </w:t>
-    </w:r>
-    <w:proofErr w:type="spellStart"/>
-    <w:r>
-      <w:rPr>
-        <w:color w:val="5B6478"/>
-        <w:sz w:val="14"/>
-        <w:szCs w:val="14"/>
-      </w:rPr>
-      <w:t>WindMill</w:t>
-    </w:r>
-    <w:proofErr w:type="spellEnd"/>
-    <w:r>
-      <w:rPr>
-        <w:color w:val="5B6478"/>
-        <w:sz w:val="14"/>
-        <w:szCs w:val="14"/>
-      </w:rPr>
-      <w:t xml:space="preserve"> Village, </w:t>
-    </w:r>
-    <w:proofErr w:type="spellStart"/>
-    <w:r>
-      <w:rPr>
-        <w:color w:val="5B6478"/>
-        <w:sz w:val="14"/>
-        <w:szCs w:val="14"/>
-      </w:rPr>
-      <w:t>Bavdhan</w:t>
-    </w:r>
-    <w:proofErr w:type="spellEnd"/>
-    <w:r>
-      <w:rPr>
-        <w:color w:val="5B6478"/>
-        <w:sz w:val="14"/>
-        <w:szCs w:val="14"/>
-      </w:rPr>
-      <w:t>, Pune 411021, Maharashtra</w:t>
+      <w:t>Address: S.NO. 257/2/2A/4 ABC Business Center, S Floor, Opp. WindMill Village Road, WindMill Village, Bavdhan, Pune 411021, Maharashtra</w:t>
     </w:r>
   </w:p>
   <w:p>
@@ -2461,7 +2311,6 @@
         <w:tab w:val="right" w:pos="9026"/>
       </w:tabs>
     </w:pPr>
-    <w:proofErr w:type="spellStart"/>
     <w:r>
       <w:rPr>
         <w:b/>
@@ -2470,18 +2319,7 @@
         <w:sz w:val="24"/>
         <w:szCs w:val="24"/>
       </w:rPr>
-      <w:t>BlechTek</w:t>
-    </w:r>
-    <w:proofErr w:type="spellEnd"/>
-    <w:r>
-      <w:rPr>
-        <w:b/>
-        <w:bCs/>
-        <w:color w:val="65AADB"/>
-        <w:sz w:val="24"/>
-        <w:szCs w:val="24"/>
-      </w:rPr>
-      <w:t xml:space="preserve"> Software Solutions LLP</w:t>
+      <w:t>BlechTek Software Solutions LLP</w:t>
     </w:r>
     <w:r>
       <w:rPr>

</xml_diff>

<commit_message>
update in the pdf and backend for showing the module wise and overall pricing correctly.
</commit_message>
<xml_diff>
--- a/QuotationApp.API/Templates/QuotationTemplate_Updated.docx
+++ b/QuotationApp.API/Templates/QuotationTemplate_Updated.docx
@@ -622,33 +622,10 @@
     </w:p>
     <w:p>
       <w:pPr>
-        <w:spacing w:after="200"/>
-        <w:rPr>
-          <w:b/>
-          <w:bCs/>
-          <w:lang w:val="en-US"/>
-        </w:rPr>
-      </w:pPr>
-    </w:p>
-    <w:p>
-      <w:pPr>
         <w:pBdr>
           <w:bottom w:val="single" w:sz="6" w:space="4" w:color="65AADB"/>
         </w:pBdr>
         <w:spacing w:before="300" w:after="150"/>
-        <w:rPr>
-          <w:b/>
-          <w:bCs/>
-          <w:lang w:val="en-US"/>
-        </w:rPr>
-      </w:pPr>
-    </w:p>
-    <w:p>
-      <w:pPr>
-        <w:pBdr>
-          <w:bottom w:val="single" w:sz="6" w:space="4" w:color="65AADB"/>
-        </w:pBdr>
-        <w:spacing w:before="300" w:after="150"/>
       </w:pPr>
       <w:r>
         <w:rPr>
@@ -659,6 +636,7 @@
           <w:sz w:val="26"/>
           <w:szCs w:val="26"/>
         </w:rPr>
+        <w:lastRenderedPageBreak/>
         <w:t>Scope</w:t>
       </w:r>
     </w:p>
@@ -1018,7 +996,7 @@
           </w:p>
           <w:p>
             <w:r>
-              <w:t>{{MODULE_REQUIREMENTS}}</w:t>
+              <w:t>{{MODULE_DETAILS}}</w:t>
             </w:r>
           </w:p>
         </w:tc>
@@ -1034,7 +1012,12 @@
           </w:tcPr>
           <w:p>
             <w:r>
-              <w:t>₹{{FinalPrice}}</w:t>
+              <w:t>{{MODULE_PRICING}}</w:t>
+            </w:r>
+          </w:p>
+          <w:p>
+            <w:r>
+              <w:t>{{OVERALL_PRICING}}</w:t>
             </w:r>
           </w:p>
         </w:tc>
@@ -1792,6 +1775,7 @@
           <w:sz w:val="26"/>
           <w:szCs w:val="26"/>
         </w:rPr>
+        <w:lastRenderedPageBreak/>
         <w:t>Terms and Conditions</w:t>
       </w:r>
     </w:p>
@@ -1994,49 +1978,49 @@
           <w:bCs/>
           <w:color w:val="65AADB"/>
         </w:rPr>
+        <w:t>10. Suggestions by Auditors / Consultants</w:t>
+      </w:r>
+    </w:p>
+    <w:p>
+      <w:pPr>
+        <w:spacing w:after="60"/>
+      </w:pPr>
+      <w:r>
+        <w:t>Any changes suggested by auditors or consultants must be raised before order finalization; later changes are chargeable separately.</w:t>
+      </w:r>
+    </w:p>
+    <w:p>
+      <w:pPr>
+        <w:spacing w:before="160" w:after="40"/>
+      </w:pPr>
+      <w:r>
+        <w:rPr>
+          <w:b/>
+          <w:bCs/>
+          <w:color w:val="65AADB"/>
+        </w:rPr>
+        <w:t>11. Legal</w:t>
+      </w:r>
+    </w:p>
+    <w:p>
+      <w:pPr>
+        <w:spacing w:after="60"/>
+      </w:pPr>
+      <w:r>
+        <w:t>Disputes arising from this order are subject to the jurisdiction of courts at Pune, Maharashtra.</w:t>
+      </w:r>
+    </w:p>
+    <w:p>
+      <w:pPr>
+        <w:spacing w:before="300" w:after="40"/>
+      </w:pPr>
+    </w:p>
+    <w:p>
+      <w:pPr>
+        <w:spacing w:before="300" w:after="40"/>
+      </w:pPr>
+      <w:r>
         <w:lastRenderedPageBreak/>
-        <w:t>10. Suggestions by Auditors / Consultants</w:t>
-      </w:r>
-    </w:p>
-    <w:p>
-      <w:pPr>
-        <w:spacing w:after="60"/>
-      </w:pPr>
-      <w:r>
-        <w:t>Any changes suggested by auditors or consultants must be raised before order finalization; later changes are chargeable separately.</w:t>
-      </w:r>
-    </w:p>
-    <w:p>
-      <w:pPr>
-        <w:spacing w:before="160" w:after="40"/>
-      </w:pPr>
-      <w:r>
-        <w:rPr>
-          <w:b/>
-          <w:bCs/>
-          <w:color w:val="65AADB"/>
-        </w:rPr>
-        <w:t>11. Legal</w:t>
-      </w:r>
-    </w:p>
-    <w:p>
-      <w:pPr>
-        <w:spacing w:after="60"/>
-      </w:pPr>
-      <w:r>
-        <w:t>Disputes arising from this order are subject to the jurisdiction of courts at Pune, Maharashtra.</w:t>
-      </w:r>
-    </w:p>
-    <w:p>
-      <w:pPr>
-        <w:spacing w:before="300" w:after="40"/>
-      </w:pPr>
-    </w:p>
-    <w:p>
-      <w:pPr>
-        <w:spacing w:before="300" w:after="40"/>
-      </w:pPr>
-      <w:r>
         <w:t>We hope this document aligns with our discussions. Please feel free to reach out for any clarification. Thanking you in anticipation.</w:t>
       </w:r>
     </w:p>
@@ -2094,6 +2078,31 @@
           <w:bCs/>
           <w:color w:val="65AADB"/>
         </w:rPr>
+      </w:pPr>
+    </w:p>
+    <w:p>
+      <w:pPr>
+        <w:spacing w:after="20"/>
+      </w:pPr>
+    </w:p>
+    <w:p>
+      <w:pPr>
+        <w:spacing w:after="20"/>
+      </w:pPr>
+    </w:p>
+    <w:p>
+      <w:pPr>
+        <w:spacing w:after="20"/>
+      </w:pPr>
+    </w:p>
+    <w:p>
+      <w:pPr>
+        <w:spacing w:after="20"/>
+      </w:pPr>
+    </w:p>
+    <w:p>
+      <w:pPr>
+        <w:spacing w:after="20"/>
       </w:pPr>
     </w:p>
     <w:p>

</xml_diff>